<commit_message>
Updated Bible resource content for multiple languages including English, French, and Hindi for 2026-06-10 release.
</commit_message>
<xml_diff>
--- a/eng/docx/006.content.docx
+++ b/eng/docx/006.content.docx
@@ -23328,40 +23328,742 @@
         <w:rPr>
           <w:lang w:val="en_US" w:bidi="en_US"/>
         </w:rPr>
-        <w:t>Flood Myths</w:t>
-      </w:r>
-      <w:r>
-        <w:rPr>
-          <w:lang w:val="en_US" w:bidi="en_US"/>
-        </w:rPr>
-      </w:r>
-    </w:p>
-    <w:p>
-      <w:pPr/>
-      <w:r>
-        <w:rPr>
-          <w:lang w:val="en_US" w:bidi="en_US"/>
-        </w:rPr>
-      </w:r>
-      <w:r>
-        <w:rPr>
-          <w:lang w:val="en_US" w:bidi="en_US"/>
-        </w:rPr>
-        <w:t>Flood myths are stories about a great flood that covers the earth. Many ancient cultures have such stories.</w:t>
-      </w:r>
-    </w:p>
-    <w:p>
-      <w:pPr/>
-      <w:r>
-        <w:rPr>
-          <w:lang w:val="en_US" w:bidi="en_US"/>
-        </w:rPr>
+        <w:t>The Flood</w:t>
+      </w:r>
+      <w:r>
+        <w:rPr>
+          <w:lang w:val="en_US" w:bidi="en_US"/>
+        </w:rPr>
+      </w:r>
+    </w:p>
+    <w:p>
+      <w:pPr/>
+      <w:r>
+        <w:rPr>
+          <w:lang w:val="en_US" w:bidi="en_US"/>
+        </w:rPr>
+      </w:r>
+      <w:r>
+        <w:rPr>
+          <w:lang w:val="en_US" w:bidi="en_US"/>
+        </w:rPr>
+        <w:t xml:space="preserve">A rising and overflowing of water to cover the land, specifically the flood associated with Noah in </w:t>
+      </w:r>
+      <w:hyperlink r:id="rId708">
+        <w:r>
+          <w:rPr>
+            <w:lang w:val="en_US" w:bidi="en_US"/>
+          </w:rPr>
+          <w:rPr>
+            <w:color w:val="0000EE"/>
+            <w:u w:val="single"/>
+          </w:rPr>
+          <w:t>Genesis 6–9</w:t>
+        </w:r>
+      </w:hyperlink>
+      <w:r>
+        <w:rPr>
+          <w:lang w:val="en_US" w:bidi="en_US"/>
+        </w:rPr>
+        <w:t>.</w:t>
+      </w:r>
+    </w:p>
+    <w:p>
+      <w:pPr>
+        <w:pStyle w:val="Heading3"/>
+      </w:pPr>
+      <w:r>
+        <w:rPr>
+          <w:lang w:val="en_US" w:bidi="en_US"/>
+        </w:rPr>
+        <w:t>Biblical Account</w:t>
+      </w:r>
+    </w:p>
+    <w:p>
+      <w:pPr/>
+      <w:r>
+        <w:rPr>
+          <w:lang w:val="en_US" w:bidi="en_US"/>
+        </w:rPr>
+      </w:r>
+      <w:r>
+        <w:rPr>
+          <w:lang w:val="en_US" w:bidi="en_US"/>
+        </w:rPr>
+        <w:t xml:space="preserve">The story of Noah’s flood in </w:t>
+      </w:r>
+      <w:hyperlink r:id="rId708">
+        <w:r>
+          <w:rPr>
+            <w:lang w:val="en_US" w:bidi="en_US"/>
+          </w:rPr>
+          <w:rPr>
+            <w:color w:val="0000EE"/>
+            <w:u w:val="single"/>
+          </w:rPr>
+          <w:t xml:space="preserve">Genesis 6–9 </w:t>
+        </w:r>
+      </w:hyperlink>
+      <w:r>
+        <w:rPr>
+          <w:lang w:val="en_US" w:bidi="en_US"/>
+        </w:rPr>
+        <w:t>is mentioned many times elsewhere in the Bible. In every case, it is treated as a real historical event (</w:t>
+      </w:r>
+      <w:hyperlink r:id="rId709">
+        <w:r>
+          <w:rPr>
+            <w:lang w:val="en_US" w:bidi="en_US"/>
+          </w:rPr>
+          <w:rPr>
+            <w:color w:val="0000EE"/>
+            <w:u w:val="single"/>
+          </w:rPr>
+          <w:t>Genesis 10:1, 32</w:t>
+        </w:r>
+      </w:hyperlink>
+      <w:r>
+        <w:rPr>
+          <w:lang w:val="en_US" w:bidi="en_US"/>
+        </w:rPr>
+        <w:t xml:space="preserve">; </w:t>
+      </w:r>
+      <w:hyperlink r:id="rId710">
+        <w:r>
+          <w:rPr>
+            <w:lang w:val="en_US" w:bidi="en_US"/>
+          </w:rPr>
+          <w:rPr>
+            <w:color w:val="0000EE"/>
+            <w:u w:val="single"/>
+          </w:rPr>
+          <w:t>11:10</w:t>
+        </w:r>
+      </w:hyperlink>
+      <w:r>
+        <w:rPr>
+          <w:lang w:val="en_US" w:bidi="en_US"/>
+        </w:rPr>
+        <w:t xml:space="preserve">; </w:t>
+      </w:r>
+      <w:hyperlink r:id="rId711">
+        <w:r>
+          <w:rPr>
+            <w:lang w:val="en_US" w:bidi="en_US"/>
+          </w:rPr>
+          <w:rPr>
+            <w:color w:val="0000EE"/>
+            <w:u w:val="single"/>
+          </w:rPr>
+          <w:t>Matthew 24:38</w:t>
+        </w:r>
+      </w:hyperlink>
+      <w:r>
+        <w:rPr>
+          <w:lang w:val="en_US" w:bidi="en_US"/>
+        </w:rPr>
+        <w:t>–</w:t>
+      </w:r>
+      <w:hyperlink r:id="rId711">
+        <w:r>
+          <w:rPr>
+            <w:lang w:val="en_US" w:bidi="en_US"/>
+          </w:rPr>
+          <w:rPr>
+            <w:color w:val="0000EE"/>
+            <w:u w:val="single"/>
+          </w:rPr>
+          <w:t>39</w:t>
+        </w:r>
+      </w:hyperlink>
+      <w:r>
+        <w:rPr>
+          <w:lang w:val="en_US" w:bidi="en_US"/>
+        </w:rPr>
+        <w:t xml:space="preserve">; </w:t>
+      </w:r>
+      <w:hyperlink r:id="rId712">
+        <w:r>
+          <w:rPr>
+            <w:lang w:val="en_US" w:bidi="en_US"/>
+          </w:rPr>
+          <w:rPr>
+            <w:color w:val="0000EE"/>
+            <w:u w:val="single"/>
+          </w:rPr>
+          <w:t>Luke 17:27</w:t>
+        </w:r>
+      </w:hyperlink>
+      <w:r>
+        <w:rPr>
+          <w:lang w:val="en_US" w:bidi="en_US"/>
+        </w:rPr>
+        <w:t xml:space="preserve">; </w:t>
+      </w:r>
+      <w:hyperlink r:id="rId713">
+        <w:r>
+          <w:rPr>
+            <w:lang w:val="en_US" w:bidi="en_US"/>
+          </w:rPr>
+          <w:rPr>
+            <w:color w:val="0000EE"/>
+            <w:u w:val="single"/>
+          </w:rPr>
+          <w:t>2 Peter 2:5</w:t>
+        </w:r>
+      </w:hyperlink>
+      <w:r>
+        <w:rPr>
+          <w:lang w:val="en_US" w:bidi="en_US"/>
+        </w:rPr>
+        <w:t xml:space="preserve">). </w:t>
+      </w:r>
+    </w:p>
+    <w:p>
+      <w:pPr/>
+      <w:r>
+        <w:rPr>
+          <w:lang w:val="en_US" w:bidi="en_US"/>
+        </w:rPr>
+      </w:r>
+      <w:r>
+        <w:rPr>
+          <w:lang w:val="en_US" w:bidi="en_US"/>
+        </w:rPr>
+        <w:t>According to the biblical account, God sent the flood because human wickedness had become widespread. It reached the point where “the wickedness of man was great upon the earth” (</w:t>
+      </w:r>
+      <w:hyperlink r:id="rId714">
+        <w:r>
+          <w:rPr>
+            <w:lang w:val="en_US" w:bidi="en_US"/>
+          </w:rPr>
+          <w:rPr>
+            <w:color w:val="0000EE"/>
+            <w:u w:val="single"/>
+          </w:rPr>
+          <w:t>Genesis 6:5</w:t>
+        </w:r>
+      </w:hyperlink>
+      <w:r>
+        <w:rPr>
+          <w:lang w:val="en_US" w:bidi="en_US"/>
+        </w:rPr>
+        <w:t xml:space="preserve">). God decided to destroy humanity and begin again with a people who would obey him (compare </w:t>
+      </w:r>
+      <w:hyperlink r:id="rId715">
+        <w:r>
+          <w:rPr>
+            <w:lang w:val="en_US" w:bidi="en_US"/>
+          </w:rPr>
+          <w:rPr>
+            <w:color w:val="0000EE"/>
+            <w:u w:val="single"/>
+          </w:rPr>
+          <w:t>Genesis 1:26</w:t>
+        </w:r>
+      </w:hyperlink>
+      <w:hyperlink r:id="rId715">
+        <w:r>
+          <w:rPr>
+            <w:lang w:val="en_US" w:bidi="en_US"/>
+          </w:rPr>
+          <w:rPr>
+            <w:color w:val="0000EE"/>
+            <w:u w:val="single"/>
+          </w:rPr>
+          <w:t>–</w:t>
+        </w:r>
+      </w:hyperlink>
+      <w:hyperlink r:id="rId715">
+        <w:r>
+          <w:rPr>
+            <w:lang w:val="en_US" w:bidi="en_US"/>
+          </w:rPr>
+          <w:rPr>
+            <w:color w:val="0000EE"/>
+            <w:u w:val="single"/>
+          </w:rPr>
+          <w:t>28</w:t>
+        </w:r>
+      </w:hyperlink>
+      <w:r>
+        <w:rPr>
+          <w:lang w:val="en_US" w:bidi="en_US"/>
+        </w:rPr>
+        <w:t xml:space="preserve">). Among all the people on earth, only Noah, his sons, and their wives remained faithful to the Lord. God used them to repopulate the earth after the flood. </w:t>
+      </w:r>
+    </w:p>
+    <w:p>
+      <w:pPr/>
+      <w:r>
+        <w:rPr>
+          <w:lang w:val="en_US" w:bidi="en_US"/>
+        </w:rPr>
+      </w:r>
+      <w:r>
+        <w:rPr>
+          <w:lang w:val="en_US" w:bidi="en_US"/>
+        </w:rPr>
+        <w:t>God gave 120 years of warning before the flood came. During that time, Noah built a large ship and preached about God’s coming judgment (</w:t>
+      </w:r>
+      <w:hyperlink r:id="rId647">
+        <w:r>
+          <w:rPr>
+            <w:lang w:val="en_US" w:bidi="en_US"/>
+          </w:rPr>
+          <w:rPr>
+            <w:color w:val="0000EE"/>
+            <w:u w:val="single"/>
+          </w:rPr>
+          <w:t>Genesis 6:3</w:t>
+        </w:r>
+      </w:hyperlink>
+      <w:r>
+        <w:rPr>
+          <w:lang w:val="en_US" w:bidi="en_US"/>
+        </w:rPr>
+        <w:t xml:space="preserve">; compare </w:t>
+      </w:r>
+      <w:hyperlink r:id="rId716">
+        <w:r>
+          <w:rPr>
+            <w:lang w:val="en_US" w:bidi="en_US"/>
+          </w:rPr>
+          <w:rPr>
+            <w:color w:val="0000EE"/>
+            <w:u w:val="single"/>
+          </w:rPr>
+          <w:t>Hebrews 11:7</w:t>
+        </w:r>
+      </w:hyperlink>
+      <w:r>
+        <w:rPr>
+          <w:lang w:val="en_US" w:bidi="en_US"/>
+        </w:rPr>
+        <w:t xml:space="preserve">; </w:t>
+      </w:r>
+      <w:hyperlink r:id="rId717">
+        <w:r>
+          <w:rPr>
+            <w:lang w:val="en_US" w:bidi="en_US"/>
+          </w:rPr>
+          <w:rPr>
+            <w:color w:val="0000EE"/>
+            <w:u w:val="single"/>
+          </w:rPr>
+          <w:t>1 Peter 3:20</w:t>
+        </w:r>
+      </w:hyperlink>
+      <w:r>
+        <w:rPr>
+          <w:lang w:val="en_US" w:bidi="en_US"/>
+        </w:rPr>
+        <w:t xml:space="preserve">; </w:t>
+      </w:r>
+      <w:hyperlink r:id="rId713">
+        <w:r>
+          <w:rPr>
+            <w:lang w:val="en_US" w:bidi="en_US"/>
+          </w:rPr>
+          <w:rPr>
+            <w:color w:val="0000EE"/>
+            <w:u w:val="single"/>
+          </w:rPr>
+          <w:t>2 Peter 2:5</w:t>
+        </w:r>
+      </w:hyperlink>
+      <w:r>
+        <w:rPr>
+          <w:lang w:val="en_US" w:bidi="en_US"/>
+        </w:rPr>
+        <w:t>). Then heavy rain fell, and water also came up from beneath the earth (</w:t>
+      </w:r>
+      <w:hyperlink r:id="rId718">
+        <w:r>
+          <w:rPr>
+            <w:lang w:val="en_US" w:bidi="en_US"/>
+          </w:rPr>
+          <w:rPr>
+            <w:color w:val="0000EE"/>
+            <w:u w:val="single"/>
+          </w:rPr>
+          <w:t>Genesis 7:11</w:t>
+        </w:r>
+      </w:hyperlink>
+      <w:r>
+        <w:rPr>
+          <w:lang w:val="en_US" w:bidi="en_US"/>
+        </w:rPr>
+        <w:t xml:space="preserve">). </w:t>
+      </w:r>
+    </w:p>
+    <w:p>
+      <w:pPr/>
+      <w:r>
+        <w:rPr>
+          <w:lang w:val="en_US" w:bidi="en_US"/>
+        </w:rPr>
+      </w:r>
+      <w:r>
+        <w:rPr>
+          <w:lang w:val="en_US" w:bidi="en_US"/>
+        </w:rPr>
+        <w:t>Only Noah's family and any land animals he brought onto the ship were saved from the water. The floodwaters covered the earth for more than a year. Eventually, the waters went down, and the earth became dry and suitable for life again (</w:t>
+      </w:r>
+      <w:hyperlink r:id="rId719">
+        <w:r>
+          <w:rPr>
+            <w:lang w:val="en_US" w:bidi="en_US"/>
+          </w:rPr>
+          <w:rPr>
+            <w:color w:val="0000EE"/>
+            <w:u w:val="single"/>
+          </w:rPr>
+          <w:t>Genesis 7:6</w:t>
+        </w:r>
+      </w:hyperlink>
+      <w:r>
+        <w:rPr>
+          <w:lang w:val="en_US" w:bidi="en_US"/>
+        </w:rPr>
+        <w:t>–</w:t>
+      </w:r>
+      <w:hyperlink r:id="rId719">
+        <w:r>
+          <w:rPr>
+            <w:lang w:val="en_US" w:bidi="en_US"/>
+          </w:rPr>
+          <w:rPr>
+            <w:color w:val="0000EE"/>
+            <w:u w:val="single"/>
+          </w:rPr>
+          <w:t>12, 24</w:t>
+        </w:r>
+      </w:hyperlink>
+      <w:r>
+        <w:rPr>
+          <w:lang w:val="en_US" w:bidi="en_US"/>
+        </w:rPr>
+        <w:t xml:space="preserve">; </w:t>
+      </w:r>
+      <w:hyperlink r:id="rId720">
+        <w:r>
+          <w:rPr>
+            <w:lang w:val="en_US" w:bidi="en_US"/>
+          </w:rPr>
+          <w:rPr>
+            <w:color w:val="0000EE"/>
+            <w:u w:val="single"/>
+          </w:rPr>
+          <w:t>8:3</w:t>
+        </w:r>
+      </w:hyperlink>
+      <w:r>
+        <w:rPr>
+          <w:lang w:val="en_US" w:bidi="en_US"/>
+        </w:rPr>
+        <w:t>–</w:t>
+      </w:r>
+      <w:hyperlink r:id="rId720">
+        <w:r>
+          <w:rPr>
+            <w:lang w:val="en_US" w:bidi="en_US"/>
+          </w:rPr>
+          <w:rPr>
+            <w:color w:val="0000EE"/>
+            <w:u w:val="single"/>
+          </w:rPr>
+          <w:t>6, 10</w:t>
+        </w:r>
+      </w:hyperlink>
+      <w:r>
+        <w:rPr>
+          <w:lang w:val="en_US" w:bidi="en_US"/>
+        </w:rPr>
+        <w:t>–</w:t>
+      </w:r>
+      <w:hyperlink r:id="rId720">
+        <w:r>
+          <w:rPr>
+            <w:lang w:val="en_US" w:bidi="en_US"/>
+          </w:rPr>
+          <w:rPr>
+            <w:color w:val="0000EE"/>
+            <w:u w:val="single"/>
+          </w:rPr>
+          <w:t>14</w:t>
+        </w:r>
+      </w:hyperlink>
+      <w:r>
+        <w:rPr>
+          <w:lang w:val="en_US" w:bidi="en_US"/>
+        </w:rPr>
+        <w:t xml:space="preserve">). </w:t>
+      </w:r>
+    </w:p>
+    <w:p>
+      <w:pPr/>
+      <w:r>
+        <w:rPr>
+          <w:lang w:val="en_US" w:bidi="en_US"/>
+        </w:rPr>
+      </w:r>
+      <w:r>
+        <w:rPr>
+          <w:lang w:val="en_US" w:bidi="en_US"/>
+        </w:rPr>
+        <w:t>When Noah and his family left the ark, they offered sacrifices to thank God. God then promised that he would never again destroy the earth with a flood.</w:t>
+      </w:r>
+    </w:p>
+    <w:p>
+      <w:pPr>
+        <w:pStyle w:val="Heading3"/>
+      </w:pPr>
+      <w:r>
+        <w:rPr>
+          <w:lang w:val="en_US" w:bidi="en_US"/>
+        </w:rPr>
+        <w:t>The Size of the Flood</w:t>
+      </w:r>
+    </w:p>
+    <w:p>
+      <w:pPr/>
+      <w:r>
+        <w:rPr>
+          <w:lang w:val="en_US" w:bidi="en_US"/>
+        </w:rPr>
+      </w:r>
+      <w:r>
+        <w:rPr>
+          <w:lang w:val="en_US" w:bidi="en_US"/>
+        </w:rPr>
+        <w:t>Scholars who believe the flood account describes a real historical event disagree about how much of the earth was covered by the flood. The story seems to suggest that the whole earth was flooded as high as the top of the highest mountains (</w:t>
+      </w:r>
+      <w:hyperlink r:id="rId721">
+        <w:r>
+          <w:rPr>
+            <w:lang w:val="en_US" w:bidi="en_US"/>
+          </w:rPr>
+          <w:rPr>
+            <w:color w:val="0000EE"/>
+            <w:u w:val="single"/>
+          </w:rPr>
+          <w:t>Genesis 7:17</w:t>
+        </w:r>
+      </w:hyperlink>
+      <w:r>
+        <w:rPr>
+          <w:lang w:val="en_US" w:bidi="en_US"/>
+        </w:rPr>
+        <w:t>–</w:t>
+      </w:r>
+      <w:hyperlink r:id="rId721">
+        <w:r>
+          <w:rPr>
+            <w:lang w:val="en_US" w:bidi="en_US"/>
+          </w:rPr>
+          <w:rPr>
+            <w:color w:val="0000EE"/>
+            <w:u w:val="single"/>
+          </w:rPr>
+          <w:t>20</w:t>
+        </w:r>
+      </w:hyperlink>
+      <w:r>
+        <w:rPr>
+          <w:lang w:val="en_US" w:bidi="en_US"/>
+        </w:rPr>
+        <w:t xml:space="preserve">; </w:t>
+      </w:r>
+      <w:hyperlink r:id="rId722">
+        <w:r>
+          <w:rPr>
+            <w:lang w:val="en_US" w:bidi="en_US"/>
+          </w:rPr>
+          <w:rPr>
+            <w:color w:val="0000EE"/>
+            <w:u w:val="single"/>
+          </w:rPr>
+          <w:t>8:4</w:t>
+        </w:r>
+      </w:hyperlink>
+      <w:r>
+        <w:rPr>
+          <w:lang w:val="en_US" w:bidi="en_US"/>
+        </w:rPr>
+        <w:t>). Some scholars have argued that waters that were high enough to cover “</w:t>
+      </w:r>
+      <w:r>
+        <w:rPr>
+          <w:lang w:val="en_US" w:bidi="en_US"/>
+        </w:rPr>
+        <w:t>all the high mountains under all the heavens</w:t>
+      </w:r>
+      <w:r>
+        <w:rPr>
+          <w:lang w:val="en_US" w:bidi="en_US"/>
+        </w:rPr>
+        <w:t>” (</w:t>
+      </w:r>
+      <w:hyperlink r:id="rId723">
+        <w:r>
+          <w:rPr>
+            <w:lang w:val="en_US" w:bidi="en_US"/>
+          </w:rPr>
+          <w:rPr>
+            <w:color w:val="0000EE"/>
+            <w:u w:val="single"/>
+          </w:rPr>
+          <w:t>Genesis 7:19</w:t>
+        </w:r>
+      </w:hyperlink>
+      <w:r>
+        <w:rPr>
+          <w:lang w:val="en_US" w:bidi="en_US"/>
+        </w:rPr>
+        <w:t xml:space="preserve">) would cover the entire earth. </w:t>
+      </w:r>
+    </w:p>
+    <w:p>
+      <w:pPr/>
+      <w:r>
+        <w:rPr>
+          <w:lang w:val="en_US" w:bidi="en_US"/>
+        </w:rPr>
+      </w:r>
+      <w:r>
+        <w:rPr>
+          <w:lang w:val="en_US" w:bidi="en_US"/>
+        </w:rPr>
+        <w:t>Others support the idea of a local flood. They argue that the story describes events from Noah’s point of view. In other words, it may have appeared to Noah that the whole earth was flooded, even if the flood did not cover the entire world. They also note that God's purpose was to destroy the human race, which may have been living only in Mesopotamia at that time. If so, a worldwide flood would not have been necessary.</w:t>
+      </w:r>
+    </w:p>
+    <w:p>
+      <w:pPr/>
+      <w:r>
+        <w:rPr>
+          <w:lang w:val="en_US" w:bidi="en_US"/>
+        </w:rPr>
+      </w:r>
+      <w:r>
+        <w:rPr>
+          <w:lang w:val="en_US" w:bidi="en_US"/>
+        </w:rPr>
+        <w:t xml:space="preserve">Some scholars also point to difficulties in translating the word </w:t>
       </w:r>
       <w:r>
         <w:rPr>
           <w:i/>
           <w:lang w:val="en_US" w:bidi="en_US"/>
         </w:rPr>
+        <w:t>earth.</w:t>
+      </w:r>
+      <w:r>
+        <w:rPr>
+          <w:lang w:val="en_US" w:bidi="en_US"/>
+        </w:rPr>
+        <w:t xml:space="preserve"> In </w:t>
+      </w:r>
+      <w:hyperlink r:id="rId724">
+        <w:r>
+          <w:rPr>
+            <w:lang w:val="en_US" w:bidi="en_US"/>
+          </w:rPr>
+          <w:rPr>
+            <w:color w:val="0000EE"/>
+            <w:u w:val="single"/>
+          </w:rPr>
+          <w:t>Genesis 1:1</w:t>
+        </w:r>
+      </w:hyperlink>
+      <w:r>
+        <w:rPr>
+          <w:lang w:val="en_US" w:bidi="en_US"/>
+        </w:rPr>
+        <w:t>, it appears in an ancient expression that refers to everything that exists (“heaven and earth” means "the universe"). In other places, the word can refer to a specific country (</w:t>
+      </w:r>
+      <w:hyperlink r:id="rId725">
+        <w:r>
+          <w:rPr>
+            <w:lang w:val="en_US" w:bidi="en_US"/>
+          </w:rPr>
+          <w:rPr>
+            <w:color w:val="0000EE"/>
+            <w:u w:val="single"/>
+          </w:rPr>
+          <w:t>Genesis 47:13</w:t>
+        </w:r>
+      </w:hyperlink>
+      <w:r>
+        <w:rPr>
+          <w:lang w:val="en_US" w:bidi="en_US"/>
+        </w:rPr>
+        <w:t>), the ground or soil (</w:t>
+      </w:r>
+      <w:hyperlink r:id="rId726">
+        <w:r>
+          <w:rPr>
+            <w:lang w:val="en_US" w:bidi="en_US"/>
+          </w:rPr>
+          <w:rPr>
+            <w:color w:val="0000EE"/>
+            <w:u w:val="single"/>
+          </w:rPr>
+          <w:t>23:15</w:t>
+        </w:r>
+      </w:hyperlink>
+      <w:r>
+        <w:rPr>
+          <w:lang w:val="en_US" w:bidi="en_US"/>
+        </w:rPr>
+        <w:t xml:space="preserve">), or other related meanings. For this reason, some scholars believe that the use of the word </w:t>
+      </w:r>
+      <w:r>
+        <w:rPr>
+          <w:i/>
+          <w:lang w:val="en_US" w:bidi="en_US"/>
+        </w:rPr>
+        <w:t>earth</w:t>
+      </w:r>
+      <w:r>
+        <w:rPr>
+          <w:lang w:val="en_US" w:bidi="en_US"/>
+        </w:rPr>
+        <w:t xml:space="preserve"> in the flood story does not necessarily mean that the entire world was covered with water.</w:t>
+      </w:r>
+    </w:p>
+    <w:p>
+      <w:pPr/>
+      <w:r>
+        <w:rPr>
+          <w:lang w:val="en_US" w:bidi="en_US"/>
+        </w:rPr>
+      </w:r>
+      <w:r>
+        <w:rPr>
+          <w:lang w:val="en_US" w:bidi="en_US"/>
+        </w:rPr>
+        <w:t>Some people who support the idea of a worldwide flood point to marine fossils found on the tops of high mountains. They argue that these fossils provide evidence for a global flood. Others disagree. They note that mountains originally rose from areas that were once under the sea. Because of this, they would expect to find marine fossils on mountain peaks even without a worldwide flood.</w:t>
+      </w:r>
+    </w:p>
+    <w:p>
+      <w:pPr/>
+      <w:r>
+        <w:rPr>
+          <w:lang w:val="en_US" w:bidi="en_US"/>
+        </w:rPr>
+      </w:r>
+      <w:r>
+        <w:rPr>
+          <w:lang w:val="en_US" w:bidi="en_US"/>
+        </w:rPr>
+        <w:t xml:space="preserve">In the end, a person's view of this question depends not only on scientific evidence but also on theological beliefs and how the biblical text is interpreted. </w:t>
+      </w:r>
+      <w:r>
+        <w:rPr>
+          <w:i/>
+          <w:lang w:val="en_US" w:bidi="en_US"/>
+        </w:rPr>
         <w:t>See</w:t>
       </w:r>
       <w:r>
@@ -23374,7 +24076,52 @@
         <w:rPr>
           <w:lang w:val="en_US" w:bidi="en_US"/>
         </w:rPr>
+        <w:t>“Scientific Evidence for the Flood?”</w:t>
+      </w:r>
+      <w:r>
+        <w:rPr>
+          <w:lang w:val="en_US" w:bidi="en_US"/>
+        </w:rPr>
+        <w:t>.</w:t>
+      </w:r>
+    </w:p>
+    <w:p>
+      <w:pPr/>
+      <w:r>
+        <w:rPr>
+          <w:lang w:val="en_US" w:bidi="en_US"/>
+        </w:rPr>
+      </w:r>
+      <w:r>
+        <w:rPr>
+          <w:i/>
+          <w:lang w:val="en_US" w:bidi="en_US"/>
+        </w:rPr>
+        <w:t>See also</w:t>
+      </w:r>
+      <w:r>
+        <w:rPr>
+          <w:lang w:val="en_US" w:bidi="en_US"/>
+        </w:rPr>
+        <w:t xml:space="preserve"> </w:t>
+      </w:r>
+      <w:r>
+        <w:rPr>
+          <w:lang w:val="en_US" w:bidi="en_US"/>
+        </w:rPr>
         <w:t>Gilgamesh Epic</w:t>
+      </w:r>
+      <w:r>
+        <w:rPr>
+          <w:lang w:val="en_US" w:bidi="en_US"/>
+        </w:rPr>
+        <w:t xml:space="preserve">; </w:t>
+      </w:r>
+      <w:r>
+        <w:rPr>
+          <w:lang w:val="en_US" w:bidi="en_US"/>
+        </w:rPr>
+        <w:t>Noah #1</w:t>
       </w:r>
       <w:r>
         <w:rPr>
@@ -23409,645 +24156,41 @@
         <w:rPr>
           <w:lang w:val="en_US" w:bidi="en_US"/>
         </w:rPr>
-        <w:t>Flood, the</w:t>
-      </w:r>
-      <w:r>
-        <w:rPr>
-          <w:lang w:val="en_US" w:bidi="en_US"/>
-        </w:rPr>
-      </w:r>
-    </w:p>
-    <w:p>
-      <w:pPr/>
-      <w:r>
-        <w:rPr>
-          <w:lang w:val="en_US" w:bidi="en_US"/>
-        </w:rPr>
-      </w:r>
-      <w:r>
-        <w:rPr>
-          <w:lang w:val="en_US" w:bidi="en_US"/>
-        </w:rPr>
-        <w:t xml:space="preserve">A rising and overflowing of water to cover the land, specifically the flood associated with Noah in </w:t>
-      </w:r>
-      <w:hyperlink r:id="rId708">
-        <w:r>
-          <w:rPr>
-            <w:lang w:val="en_US" w:bidi="en_US"/>
-          </w:rPr>
-          <w:rPr>
-            <w:color w:val="0000EE"/>
-            <w:u w:val="single"/>
-          </w:rPr>
-          <w:t>Genesis 6–9</w:t>
-        </w:r>
-      </w:hyperlink>
-      <w:r>
-        <w:rPr>
-          <w:lang w:val="en_US" w:bidi="en_US"/>
-        </w:rPr>
-        <w:t>.</w:t>
-      </w:r>
-    </w:p>
-    <w:p>
-      <w:pPr>
-        <w:pStyle w:val="Heading3"/>
-      </w:pPr>
-      <w:r>
-        <w:rPr>
-          <w:lang w:val="en_US" w:bidi="en_US"/>
-        </w:rPr>
-        <w:t>Biblical Account</w:t>
-      </w:r>
-    </w:p>
-    <w:p>
-      <w:pPr/>
-      <w:r>
-        <w:rPr>
-          <w:lang w:val="en_US" w:bidi="en_US"/>
-        </w:rPr>
-      </w:r>
-      <w:r>
-        <w:rPr>
-          <w:lang w:val="en_US" w:bidi="en_US"/>
-        </w:rPr>
-        <w:t xml:space="preserve">The story of Noah’s flood is told in </w:t>
-      </w:r>
-      <w:hyperlink r:id="rId708">
-        <w:r>
-          <w:rPr>
-            <w:lang w:val="en_US" w:bidi="en_US"/>
-          </w:rPr>
-          <w:rPr>
-            <w:color w:val="0000EE"/>
-            <w:u w:val="single"/>
-          </w:rPr>
-          <w:t>Genesis 6–9</w:t>
-        </w:r>
-      </w:hyperlink>
-      <w:r>
-        <w:rPr>
-          <w:lang w:val="en_US" w:bidi="en_US"/>
-        </w:rPr>
-        <w:t>. It is mentioned often in the Bible, always as a real event (</w:t>
-      </w:r>
-      <w:hyperlink r:id="rId709">
-        <w:r>
-          <w:rPr>
-            <w:lang w:val="en_US" w:bidi="en_US"/>
-          </w:rPr>
-          <w:rPr>
-            <w:color w:val="0000EE"/>
-            <w:u w:val="single"/>
-          </w:rPr>
-          <w:t>Genesis 10:1, 32</w:t>
-        </w:r>
-      </w:hyperlink>
-      <w:r>
-        <w:rPr>
-          <w:lang w:val="en_US" w:bidi="en_US"/>
-        </w:rPr>
-        <w:t xml:space="preserve">; </w:t>
-      </w:r>
-      <w:hyperlink r:id="rId710">
-        <w:r>
-          <w:rPr>
-            <w:lang w:val="en_US" w:bidi="en_US"/>
-          </w:rPr>
-          <w:rPr>
-            <w:color w:val="0000EE"/>
-            <w:u w:val="single"/>
-          </w:rPr>
-          <w:t>11:10</w:t>
-        </w:r>
-      </w:hyperlink>
-      <w:r>
-        <w:rPr>
-          <w:lang w:val="en_US" w:bidi="en_US"/>
-        </w:rPr>
-        <w:t xml:space="preserve">; </w:t>
-      </w:r>
-      <w:hyperlink r:id="rId711">
-        <w:r>
-          <w:rPr>
-            <w:lang w:val="en_US" w:bidi="en_US"/>
-          </w:rPr>
-          <w:rPr>
-            <w:color w:val="0000EE"/>
-            <w:u w:val="single"/>
-          </w:rPr>
-          <w:t>Matthew 24:38</w:t>
-        </w:r>
-      </w:hyperlink>
-      <w:r>
-        <w:rPr>
-          <w:lang w:val="en_US" w:bidi="en_US"/>
-        </w:rPr>
-        <w:t>–</w:t>
-      </w:r>
-      <w:hyperlink r:id="rId711">
-        <w:r>
-          <w:rPr>
-            <w:lang w:val="en_US" w:bidi="en_US"/>
-          </w:rPr>
-          <w:rPr>
-            <w:color w:val="0000EE"/>
-            <w:u w:val="single"/>
-          </w:rPr>
-          <w:t>39</w:t>
-        </w:r>
-      </w:hyperlink>
-      <w:r>
-        <w:rPr>
-          <w:lang w:val="en_US" w:bidi="en_US"/>
-        </w:rPr>
-        <w:t xml:space="preserve">; </w:t>
-      </w:r>
-      <w:hyperlink r:id="rId712">
-        <w:r>
-          <w:rPr>
-            <w:lang w:val="en_US" w:bidi="en_US"/>
-          </w:rPr>
-          <w:rPr>
-            <w:color w:val="0000EE"/>
-            <w:u w:val="single"/>
-          </w:rPr>
-          <w:t>Luke 17:27</w:t>
-        </w:r>
-      </w:hyperlink>
-      <w:r>
-        <w:rPr>
-          <w:lang w:val="en_US" w:bidi="en_US"/>
-        </w:rPr>
-        <w:t xml:space="preserve">; </w:t>
-      </w:r>
-      <w:hyperlink r:id="rId713">
-        <w:r>
-          <w:rPr>
-            <w:lang w:val="en_US" w:bidi="en_US"/>
-          </w:rPr>
-          <w:rPr>
-            <w:color w:val="0000EE"/>
-            <w:u w:val="single"/>
-          </w:rPr>
-          <w:t>2 Peter 2:5</w:t>
-        </w:r>
-      </w:hyperlink>
-      <w:r>
-        <w:rPr>
-          <w:lang w:val="en_US" w:bidi="en_US"/>
-        </w:rPr>
-        <w:t>). In the Bible, God sent the flood because of sin, which was so bad that “the wickedness of man was great upon the earth” (</w:t>
-      </w:r>
-      <w:hyperlink r:id="rId714">
-        <w:r>
-          <w:rPr>
-            <w:lang w:val="en_US" w:bidi="en_US"/>
-          </w:rPr>
-          <w:rPr>
-            <w:color w:val="0000EE"/>
-            <w:u w:val="single"/>
-          </w:rPr>
-          <w:t>Genesis 6:5</w:t>
-        </w:r>
-      </w:hyperlink>
-      <w:r>
-        <w:rPr>
-          <w:lang w:val="en_US" w:bidi="en_US"/>
-        </w:rPr>
-        <w:t xml:space="preserve">). God decided to destroy everyone and start again with people who would obey him (compare </w:t>
-      </w:r>
-      <w:hyperlink r:id="rId715">
-        <w:r>
-          <w:rPr>
-            <w:lang w:val="en_US" w:bidi="en_US"/>
-          </w:rPr>
-          <w:rPr>
-            <w:color w:val="0000EE"/>
-            <w:u w:val="single"/>
-          </w:rPr>
-          <w:t>Genesis 1:26</w:t>
-        </w:r>
-      </w:hyperlink>
-      <w:hyperlink r:id="rId715">
-        <w:r>
-          <w:rPr>
-            <w:lang w:val="en_US" w:bidi="en_US"/>
-          </w:rPr>
-          <w:rPr>
-            <w:color w:val="0000EE"/>
-            <w:u w:val="single"/>
-          </w:rPr>
-          <w:t>–</w:t>
-        </w:r>
-      </w:hyperlink>
-      <w:hyperlink r:id="rId715">
-        <w:r>
-          <w:rPr>
-            <w:lang w:val="en_US" w:bidi="en_US"/>
-          </w:rPr>
-          <w:rPr>
-            <w:color w:val="0000EE"/>
-            <w:u w:val="single"/>
-          </w:rPr>
-          <w:t>28</w:t>
-        </w:r>
-      </w:hyperlink>
-      <w:r>
-        <w:rPr>
-          <w:lang w:val="en_US" w:bidi="en_US"/>
-        </w:rPr>
-        <w:t xml:space="preserve">). The only people who were faithful to the Lord were Noah, his sons, and their wives. God used them to recreate the earth after its destruction. </w:t>
-      </w:r>
-    </w:p>
-    <w:p>
-      <w:pPr/>
-      <w:r>
-        <w:rPr>
-          <w:lang w:val="en_US" w:bidi="en_US"/>
-        </w:rPr>
-      </w:r>
-      <w:r>
-        <w:rPr>
-          <w:lang w:val="en_US" w:bidi="en_US"/>
-        </w:rPr>
-        <w:t>Noah spent 120 years building a great ship and warning people about God’s coming judgment (</w:t>
-      </w:r>
-      <w:hyperlink r:id="rId647">
-        <w:r>
-          <w:rPr>
-            <w:lang w:val="en_US" w:bidi="en_US"/>
-          </w:rPr>
-          <w:rPr>
-            <w:color w:val="0000EE"/>
-            <w:u w:val="single"/>
-          </w:rPr>
-          <w:t>Genesis 6:3</w:t>
-        </w:r>
-      </w:hyperlink>
-      <w:r>
-        <w:rPr>
-          <w:lang w:val="en_US" w:bidi="en_US"/>
-        </w:rPr>
-        <w:t xml:space="preserve">; compare </w:t>
-      </w:r>
-      <w:hyperlink r:id="rId716">
-        <w:r>
-          <w:rPr>
-            <w:lang w:val="en_US" w:bidi="en_US"/>
-          </w:rPr>
-          <w:rPr>
-            <w:color w:val="0000EE"/>
-            <w:u w:val="single"/>
-          </w:rPr>
-          <w:t>Hebrews 11:7</w:t>
-        </w:r>
-      </w:hyperlink>
-      <w:r>
-        <w:rPr>
-          <w:lang w:val="en_US" w:bidi="en_US"/>
-        </w:rPr>
-        <w:t xml:space="preserve">; </w:t>
-      </w:r>
-      <w:hyperlink r:id="rId717">
-        <w:r>
-          <w:rPr>
-            <w:lang w:val="en_US" w:bidi="en_US"/>
-          </w:rPr>
-          <w:rPr>
-            <w:color w:val="0000EE"/>
-            <w:u w:val="single"/>
-          </w:rPr>
-          <w:t>1 Peter 3:20</w:t>
-        </w:r>
-      </w:hyperlink>
-      <w:r>
-        <w:rPr>
-          <w:lang w:val="en_US" w:bidi="en_US"/>
-        </w:rPr>
-        <w:t xml:space="preserve">; </w:t>
-      </w:r>
-      <w:hyperlink r:id="rId713">
-        <w:r>
-          <w:rPr>
-            <w:lang w:val="en_US" w:bidi="en_US"/>
-          </w:rPr>
-          <w:rPr>
-            <w:color w:val="0000EE"/>
-            <w:u w:val="single"/>
-          </w:rPr>
-          <w:t>2 Peter 2:5</w:t>
-        </w:r>
-      </w:hyperlink>
-      <w:r>
-        <w:rPr>
-          <w:lang w:val="en_US" w:bidi="en_US"/>
-        </w:rPr>
-        <w:t>). When the flood came, it rained heavily, and the underground waters rose (</w:t>
-      </w:r>
-      <w:hyperlink r:id="rId718">
-        <w:r>
-          <w:rPr>
-            <w:lang w:val="en_US" w:bidi="en_US"/>
-          </w:rPr>
-          <w:rPr>
-            <w:color w:val="0000EE"/>
-            <w:u w:val="single"/>
-          </w:rPr>
-          <w:t>Genesis 7:11</w:t>
-        </w:r>
-      </w:hyperlink>
-      <w:r>
-        <w:rPr>
-          <w:lang w:val="en_US" w:bidi="en_US"/>
-        </w:rPr>
-        <w:t>). Only Noah's family and any land animals he brought onto the ship were saved from the water. The flood lasted for more than a year. Finally, the waters went down, and the earth was dry again (</w:t>
-      </w:r>
-      <w:hyperlink r:id="rId719">
-        <w:r>
-          <w:rPr>
-            <w:lang w:val="en_US" w:bidi="en_US"/>
-          </w:rPr>
-          <w:rPr>
-            <w:color w:val="0000EE"/>
-            <w:u w:val="single"/>
-          </w:rPr>
-          <w:t>Genesis 7:6</w:t>
-        </w:r>
-      </w:hyperlink>
-      <w:r>
-        <w:rPr>
-          <w:lang w:val="en_US" w:bidi="en_US"/>
-        </w:rPr>
-        <w:t>–</w:t>
-      </w:r>
-      <w:hyperlink r:id="rId719">
-        <w:r>
-          <w:rPr>
-            <w:lang w:val="en_US" w:bidi="en_US"/>
-          </w:rPr>
-          <w:rPr>
-            <w:color w:val="0000EE"/>
-            <w:u w:val="single"/>
-          </w:rPr>
-          <w:t>12, 24</w:t>
-        </w:r>
-      </w:hyperlink>
-      <w:r>
-        <w:rPr>
-          <w:lang w:val="en_US" w:bidi="en_US"/>
-        </w:rPr>
-        <w:t xml:space="preserve">; </w:t>
-      </w:r>
-      <w:hyperlink r:id="rId720">
-        <w:r>
-          <w:rPr>
-            <w:lang w:val="en_US" w:bidi="en_US"/>
-          </w:rPr>
-          <w:rPr>
-            <w:color w:val="0000EE"/>
-            <w:u w:val="single"/>
-          </w:rPr>
-          <w:t>8:3</w:t>
-        </w:r>
-      </w:hyperlink>
-      <w:r>
-        <w:rPr>
-          <w:lang w:val="en_US" w:bidi="en_US"/>
-        </w:rPr>
-        <w:t>–</w:t>
-      </w:r>
-      <w:hyperlink r:id="rId720">
-        <w:r>
-          <w:rPr>
-            <w:lang w:val="en_US" w:bidi="en_US"/>
-          </w:rPr>
-          <w:rPr>
-            <w:color w:val="0000EE"/>
-            <w:u w:val="single"/>
-          </w:rPr>
-          <w:t>6, 10</w:t>
-        </w:r>
-      </w:hyperlink>
-      <w:r>
-        <w:rPr>
-          <w:lang w:val="en_US" w:bidi="en_US"/>
-        </w:rPr>
-        <w:t>–</w:t>
-      </w:r>
-      <w:hyperlink r:id="rId720">
-        <w:r>
-          <w:rPr>
-            <w:lang w:val="en_US" w:bidi="en_US"/>
-          </w:rPr>
-          <w:rPr>
-            <w:color w:val="0000EE"/>
-            <w:u w:val="single"/>
-          </w:rPr>
-          <w:t>14</w:t>
-        </w:r>
-      </w:hyperlink>
-      <w:r>
-        <w:rPr>
-          <w:lang w:val="en_US" w:bidi="en_US"/>
-        </w:rPr>
-        <w:t>). When Noah and his family left the ark, they gave sacrifices to God to thank him. God promised he would never send another flood to destroy the earth.</w:t>
-      </w:r>
-    </w:p>
-    <w:p>
-      <w:pPr>
-        <w:pStyle w:val="Heading3"/>
-      </w:pPr>
-      <w:r>
-        <w:rPr>
-          <w:lang w:val="en_US" w:bidi="en_US"/>
-        </w:rPr>
-        <w:t>The Size of the Flood</w:t>
-      </w:r>
-    </w:p>
-    <w:p>
-      <w:pPr/>
-      <w:r>
-        <w:rPr>
-          <w:lang w:val="en_US" w:bidi="en_US"/>
-        </w:rPr>
-      </w:r>
-      <w:r>
-        <w:rPr>
-          <w:lang w:val="en_US" w:bidi="en_US"/>
-        </w:rPr>
-        <w:t>Those who believe the flood account is true disagree about its size. The story seems to suggest that the whole earth was flooded as high as the top of the highest mountains (</w:t>
-      </w:r>
-      <w:hyperlink r:id="rId721">
-        <w:r>
-          <w:rPr>
-            <w:lang w:val="en_US" w:bidi="en_US"/>
-          </w:rPr>
-          <w:rPr>
-            <w:color w:val="0000EE"/>
-            <w:u w:val="single"/>
-          </w:rPr>
-          <w:t>Genesis 7:17</w:t>
-        </w:r>
-      </w:hyperlink>
-      <w:r>
-        <w:rPr>
-          <w:lang w:val="en_US" w:bidi="en_US"/>
-        </w:rPr>
-        <w:t>–</w:t>
-      </w:r>
-      <w:hyperlink r:id="rId721">
-        <w:r>
-          <w:rPr>
-            <w:lang w:val="en_US" w:bidi="en_US"/>
-          </w:rPr>
-          <w:rPr>
-            <w:color w:val="0000EE"/>
-            <w:u w:val="single"/>
-          </w:rPr>
-          <w:t>20</w:t>
-        </w:r>
-      </w:hyperlink>
-      <w:r>
-        <w:rPr>
-          <w:lang w:val="en_US" w:bidi="en_US"/>
-        </w:rPr>
-        <w:t xml:space="preserve">; </w:t>
-      </w:r>
-      <w:hyperlink r:id="rId722">
-        <w:r>
-          <w:rPr>
-            <w:lang w:val="en_US" w:bidi="en_US"/>
-          </w:rPr>
-          <w:rPr>
-            <w:color w:val="0000EE"/>
-            <w:u w:val="single"/>
-          </w:rPr>
-          <w:t>8:4</w:t>
-        </w:r>
-      </w:hyperlink>
-      <w:r>
-        <w:rPr>
-          <w:lang w:val="en_US" w:bidi="en_US"/>
-        </w:rPr>
-        <w:t>). Some have argued that waters that were high enough to cover “</w:t>
-      </w:r>
-      <w:r>
-        <w:rPr>
-          <w:lang w:val="en_US" w:bidi="en_US"/>
-        </w:rPr>
-        <w:t>all the high mountains under all the heavens</w:t>
-      </w:r>
-      <w:r>
-        <w:rPr>
-          <w:lang w:val="en_US" w:bidi="en_US"/>
-        </w:rPr>
-        <w:t>” (</w:t>
-      </w:r>
-      <w:hyperlink r:id="rId723">
-        <w:r>
-          <w:rPr>
-            <w:lang w:val="en_US" w:bidi="en_US"/>
-          </w:rPr>
-          <w:rPr>
-            <w:color w:val="0000EE"/>
-            <w:u w:val="single"/>
-          </w:rPr>
-          <w:t>Genesis 7:19</w:t>
-        </w:r>
-      </w:hyperlink>
-      <w:r>
-        <w:rPr>
-          <w:lang w:val="en_US" w:bidi="en_US"/>
-        </w:rPr>
-        <w:t xml:space="preserve">) would cover the entire earth. Those who argue for a local flood note that the text says that it </w:t>
+        <w:t>Flood Myths</w:t>
+      </w:r>
+      <w:r>
+        <w:rPr>
+          <w:lang w:val="en_US" w:bidi="en_US"/>
+        </w:rPr>
+      </w:r>
+    </w:p>
+    <w:p>
+      <w:pPr/>
+      <w:r>
+        <w:rPr>
+          <w:lang w:val="en_US" w:bidi="en_US"/>
+        </w:rPr>
+      </w:r>
+      <w:r>
+        <w:rPr>
+          <w:lang w:val="en_US" w:bidi="en_US"/>
+        </w:rPr>
+        <w:t>Flood myths are stories about a great flood that covers the earth. Many ancient cultures have such stories.</w:t>
+      </w:r>
+    </w:p>
+    <w:p>
+      <w:pPr/>
+      <w:r>
+        <w:rPr>
+          <w:lang w:val="en_US" w:bidi="en_US"/>
+        </w:rPr>
       </w:r>
       <w:r>
         <w:rPr>
           <w:i/>
           <w:lang w:val="en_US" w:bidi="en_US"/>
         </w:rPr>
-        <w:t>appeared</w:t>
-      </w:r>
-      <w:r>
-        <w:rPr>
-          <w:lang w:val="en_US" w:bidi="en_US"/>
-        </w:rPr>
-        <w:t xml:space="preserve"> that all the earth was flooded. So, a worldwide flood was unnecessary. God wanted to destroy humans, who may have only lived in Mesopotamia at that time. Others argue that in the Bible, “earth” is often not meant literally. In </w:t>
-      </w:r>
-      <w:hyperlink r:id="rId724">
-        <w:r>
-          <w:rPr>
-            <w:lang w:val="en_US" w:bidi="en_US"/>
-          </w:rPr>
-          <w:rPr>
-            <w:color w:val="0000EE"/>
-            <w:u w:val="single"/>
-          </w:rPr>
-          <w:t>Genesis 1:1</w:t>
-        </w:r>
-      </w:hyperlink>
-      <w:r>
-        <w:rPr>
-          <w:lang w:val="en_US" w:bidi="en_US"/>
-        </w:rPr>
-        <w:t>, “heaven and earth” means "the universe." Sometimes “earth” describes a single country (</w:t>
-      </w:r>
-      <w:hyperlink r:id="rId725">
-        <w:r>
-          <w:rPr>
-            <w:lang w:val="en_US" w:bidi="en_US"/>
-          </w:rPr>
-          <w:rPr>
-            <w:color w:val="0000EE"/>
-            <w:u w:val="single"/>
-          </w:rPr>
-          <w:t>Genesis 47:13</w:t>
-        </w:r>
-      </w:hyperlink>
-      <w:r>
-        <w:rPr>
-          <w:lang w:val="en_US" w:bidi="en_US"/>
-        </w:rPr>
-        <w:t>), the soil itself (</w:t>
-      </w:r>
-      <w:hyperlink r:id="rId726">
-        <w:r>
-          <w:rPr>
-            <w:lang w:val="en_US" w:bidi="en_US"/>
-          </w:rPr>
-          <w:rPr>
-            <w:color w:val="0000EE"/>
-            <w:u w:val="single"/>
-          </w:rPr>
-          <w:t>23:15</w:t>
-        </w:r>
-      </w:hyperlink>
-      <w:r>
-        <w:rPr>
-          <w:lang w:val="en_US" w:bidi="en_US"/>
-        </w:rPr>
-        <w:t>), and so on. So, it isn't necessary to think that the Genesis flood story implies the entire world was flooded.</w:t>
-      </w:r>
-    </w:p>
-    <w:p>
-      <w:pPr/>
-      <w:r>
-        <w:rPr>
-          <w:lang w:val="en_US" w:bidi="en_US"/>
-        </w:rPr>
-      </w:r>
-      <w:r>
-        <w:rPr>
-          <w:lang w:val="en_US" w:bidi="en_US"/>
-        </w:rPr>
-        <w:t xml:space="preserve">Some people who believe in a universal flood argue that there are marine fossils on the tops of mountains, so the water must have covered them. Others disagree, saying that all mountains originally came from the seas, so it is reasonable that there is evidence of marine life on them. </w:t>
-      </w:r>
-      <w:r>
-        <w:rPr>
-          <w:lang w:val="en_US" w:bidi="en_US"/>
-        </w:rPr>
-        <w:t>Theological beliefs and interpretations of the Bible determine whether people think the flood was global or local.</w:t>
+        <w:t>See</w:t>
       </w:r>
       <w:r>
         <w:rPr>
@@ -24057,67 +24200,9 @@
       </w:r>
       <w:r>
         <w:rPr>
-          <w:i/>
-          <w:lang w:val="en_US" w:bidi="en_US"/>
-        </w:rPr>
-        <w:t>See</w:t>
-      </w:r>
-      <w:r>
-        <w:rPr>
-          <w:lang w:val="en_US" w:bidi="en_US"/>
-        </w:rPr>
-        <w:t xml:space="preserve"> </w:t>
-      </w:r>
-      <w:r>
-        <w:rPr>
-          <w:lang w:val="en_US" w:bidi="en_US"/>
-        </w:rPr>
-        <w:t>“Scientific Evidence for the Flood?”</w:t>
-      </w:r>
-      <w:r>
-        <w:rPr>
-          <w:lang w:val="en_US" w:bidi="en_US"/>
-        </w:rPr>
-        <w:t>.</w:t>
-      </w:r>
-    </w:p>
-    <w:p>
-      <w:pPr/>
-      <w:r>
-        <w:rPr>
-          <w:lang w:val="en_US" w:bidi="en_US"/>
-        </w:rPr>
-      </w:r>
-      <w:r>
-        <w:rPr>
-          <w:i/>
-          <w:lang w:val="en_US" w:bidi="en_US"/>
-        </w:rPr>
-        <w:t>See also</w:t>
-      </w:r>
-      <w:r>
-        <w:rPr>
-          <w:lang w:val="en_US" w:bidi="en_US"/>
-        </w:rPr>
-        <w:t xml:space="preserve"> </w:t>
-      </w:r>
-      <w:r>
-        <w:rPr>
           <w:lang w:val="en_US" w:bidi="en_US"/>
         </w:rPr>
         <w:t>Gilgamesh Epic</w:t>
-      </w:r>
-      <w:r>
-        <w:rPr>
-          <w:lang w:val="en_US" w:bidi="en_US"/>
-        </w:rPr>
-        <w:t xml:space="preserve">; </w:t>
-      </w:r>
-      <w:r>
-        <w:rPr>
-          <w:lang w:val="en_US" w:bidi="en_US"/>
-        </w:rPr>
-        <w:t>Noah #1</w:t>
       </w:r>
       <w:r>
         <w:rPr>
@@ -31082,21 +31167,86 @@
         <w:rPr>
           <w:lang w:val="en_US" w:bidi="en_US"/>
         </w:rPr>
-        <w:t>God's activity of deciding events and outcomes before they happen. People often use "foreordination" and "predestination" to mean the same thing. However, "predestination" and "election" specifically refer to the destiny of people.</w:t>
-      </w:r>
-    </w:p>
-    <w:p>
-      <w:pPr/>
-      <w:r>
-        <w:rPr>
-          <w:lang w:val="en_US" w:bidi="en_US"/>
-        </w:rPr>
-      </w:r>
-      <w:r>
-        <w:rPr>
-          <w:lang w:val="en_US" w:bidi="en_US"/>
-        </w:rPr>
-        <w:t>Many early church fathers wrote about foreordination. Augustine of Hippo, who lived from 354 to 430, emphasized foreordination in his teachings. Augustine greatly influenced the Protestant Reformers, especially John Calvin. Reformed theologians start studying foreordination by looking at God's eternal decree, as shown in statements of belief like the Westminster Confession of Faith. God's decree is one, but people usually talk about it as "the decrees of God" to help explain it. Martin Luther believed in foreordination but didn't stress it as much as Calvin. Luther's teachings don't say much about foreordination, mainly discussing predestination or election. Modern Lutheran thought emphasizes conditional election, rather than absolute election. This means they believe election or predestination is based on faith that God sees ahead of time.</w:t>
+        <w:t xml:space="preserve">Foreordination is God's activity of deciding events and outcomes before they happen. People often use the words </w:t>
+      </w:r>
+      <w:r>
+        <w:rPr>
+          <w:i/>
+          <w:lang w:val="en_US" w:bidi="en_US"/>
+        </w:rPr>
+        <w:t>foreordination</w:t>
+      </w:r>
+      <w:r>
+        <w:rPr>
+          <w:lang w:val="en_US" w:bidi="en_US"/>
+        </w:rPr>
+        <w:t xml:space="preserve"> and </w:t>
+      </w:r>
+      <w:r>
+        <w:rPr>
+          <w:i/>
+          <w:lang w:val="en_US" w:bidi="en_US"/>
+        </w:rPr>
+        <w:t>predestination</w:t>
+      </w:r>
+      <w:r>
+        <w:rPr>
+          <w:lang w:val="en_US" w:bidi="en_US"/>
+        </w:rPr>
+        <w:t xml:space="preserve"> to mean the same thing. However, </w:t>
+      </w:r>
+      <w:r>
+        <w:rPr>
+          <w:i/>
+          <w:lang w:val="en_US" w:bidi="en_US"/>
+        </w:rPr>
+        <w:t>predestination</w:t>
+      </w:r>
+      <w:r>
+        <w:rPr>
+          <w:lang w:val="en_US" w:bidi="en_US"/>
+        </w:rPr>
+        <w:t xml:space="preserve"> and </w:t>
+      </w:r>
+      <w:r>
+        <w:rPr>
+          <w:i/>
+          <w:lang w:val="en_US" w:bidi="en_US"/>
+        </w:rPr>
+        <w:t>election</w:t>
+      </w:r>
+      <w:r>
+        <w:rPr>
+          <w:lang w:val="en_US" w:bidi="en_US"/>
+        </w:rPr>
+        <w:t xml:space="preserve"> specifically refer to the destiny of people.</w:t>
+      </w:r>
+    </w:p>
+    <w:p>
+      <w:pPr/>
+      <w:r>
+        <w:rPr>
+          <w:lang w:val="en_US" w:bidi="en_US"/>
+        </w:rPr>
+      </w:r>
+      <w:r>
+        <w:rPr>
+          <w:lang w:val="en_US" w:bidi="en_US"/>
+        </w:rPr>
+        <w:t xml:space="preserve">Many early church fathers wrote about foreordination. Augustine of Hippo, who lived from 354 to 430, emphasized foreordination in his teachings. Augustine greatly influenced the Protestant Reformers, especially John Calvin. Reformed theologians start studying foreordination by looking at God's eternal decree, as shown in statements of belief like the Westminster Confession of Faith. God's decree is one, but people usually refer to it as </w:t>
+      </w:r>
+      <w:r>
+        <w:rPr>
+          <w:i/>
+          <w:lang w:val="en_US" w:bidi="en_US"/>
+        </w:rPr>
+        <w:t>the decrees of God</w:t>
+      </w:r>
+      <w:r>
+        <w:rPr>
+          <w:lang w:val="en_US" w:bidi="en_US"/>
+        </w:rPr>
+        <w:t xml:space="preserve"> to help explain it. Martin Luther believed in foreordination but didn't stress it as much as Calvin. Luther's teachings don't say much about foreordination, mainly discussing predestination or election. Modern Lutheran thought emphasizes conditional election, rather than absolute election. This means they believe election or predestination is based on faith that God sees ahead of time.</w:t>
       </w:r>
     </w:p>
     <w:p>
@@ -31473,25 +31623,7 @@
         <w:rPr>
           <w:lang w:val="en_US" w:bidi="en_US"/>
         </w:rPr>
-        <w:t xml:space="preserve">The Bible also says: </w:t>
-      </w:r>
-    </w:p>
-    <w:p>
-      <w:pPr>
-        <w:pStyle w:val="ListBullet"/>
-        <w:spacing w:line="240" w:lineRule="auto"/>
-        <w:ind w:left="720"/>
-      </w:pPr>
-      <w:r>
-        <w:rPr>
-          <w:lang w:val="en_US" w:bidi="en_US"/>
-        </w:rPr>
-      </w:r>
-      <w:r>
-        <w:rPr>
-          <w:lang w:val="en_US" w:bidi="en_US"/>
-        </w:rPr>
-        <w:t>a person's life span is determined (</w:t>
+        <w:t>In human life, God is understood to determine the length of each person's life (</w:t>
       </w:r>
       <w:hyperlink r:id="rId941">
         <w:r>
@@ -31509,25 +31641,7 @@
         <w:rPr>
           <w:lang w:val="en_US" w:bidi="en_US"/>
         </w:rPr>
-        <w:t xml:space="preserve">) </w:t>
-      </w:r>
-    </w:p>
-    <w:p>
-      <w:pPr>
-        <w:pStyle w:val="ListBullet"/>
-        <w:spacing w:line="240" w:lineRule="auto"/>
-        <w:ind w:left="720"/>
-      </w:pPr>
-      <w:r>
-        <w:rPr>
-          <w:lang w:val="en_US" w:bidi="en_US"/>
-        </w:rPr>
-      </w:r>
-      <w:r>
-        <w:rPr>
-          <w:lang w:val="en_US" w:bidi="en_US"/>
-        </w:rPr>
-        <w:t>God’s concern extends to his creatures (</w:t>
+        <w:t>). God's care extends to all his creatures (</w:t>
       </w:r>
       <w:hyperlink r:id="rId942">
         <w:r>
@@ -31587,25 +31701,7 @@
         <w:rPr>
           <w:lang w:val="en_US" w:bidi="en_US"/>
         </w:rPr>
-        <w:t xml:space="preserve">) </w:t>
-      </w:r>
-    </w:p>
-    <w:p>
-      <w:pPr>
-        <w:pStyle w:val="ListBullet"/>
-        <w:spacing w:line="240" w:lineRule="auto"/>
-        <w:ind w:left="720"/>
-      </w:pPr>
-      <w:r>
-        <w:rPr>
-          <w:lang w:val="en_US" w:bidi="en_US"/>
-        </w:rPr>
-      </w:r>
-      <w:r>
-        <w:rPr>
-          <w:lang w:val="en_US" w:bidi="en_US"/>
-        </w:rPr>
-        <w:t>the hairs on our heads are numbered (</w:t>
+        <w:t>). God even knows the number of hairs on each person's head (</w:t>
       </w:r>
       <w:hyperlink r:id="rId943">
         <w:r>
@@ -31623,7 +31719,7 @@
         <w:rPr>
           <w:lang w:val="en_US" w:bidi="en_US"/>
         </w:rPr>
-        <w:t>)</w:t>
+        <w:t>).</w:t>
       </w:r>
     </w:p>
     <w:p>
@@ -32090,7 +32186,7 @@
         <w:rPr>
           <w:lang w:val="en_US" w:bidi="en_US"/>
         </w:rPr>
-        <w:t>Foreordination is implied in providence or God’s care. Providence is the achievement of God’s plan for the world. God’s care and control for creation show his plan of redemption for humanity made in his image. God controls history, but God is not responsible for sin. He created human beings to be able to say "yes" or "no" to him. But God’s plan cannot be stopped. It continues despite opposition. God’s ultimate plan is happening throughout all events of human history, both evil and good. But his sovereignty is not imposed without reason or fairness. God is not a tyrant but rather is holy, loving, and righteous. His plan is carried out according to his nature, shown in care and concern for creation and in steadfast love for sinners.</w:t>
+        <w:t>Foreordination is implied in providence or God’s care. Providence is the achievement of God’s plan for the world. God’s care and control for creation show his plan of redemption for humanity made in his image. God controls history, but God is not responsible for sin. He created human beings to be able to say yes or no to him. But God’s plan cannot be stopped. It continues despite opposition. God’s ultimate plan is happening throughout all events of human history, both evil and good. But his sovereignty is not imposed without reason or fairness. God is not a tyrant but rather is holy, loving, and righteous. His plan is carried out according to his nature, shown in care and concern for creation and in steadfast love for sinners.</w:t>
       </w:r>
     </w:p>
     <w:p>

</xml_diff>

<commit_message>
Update multiple language editions including English, Portuguese, and Hindi for 2026-06-29 release
</commit_message>
<xml_diff>
--- a/eng/docx/006.content.docx
+++ b/eng/docx/006.content.docx
@@ -38002,7 +38002,74 @@
         <w:rPr>
           <w:lang w:val="en_US" w:bidi="en_US"/>
         </w:rPr>
-        <w:t>). So, it would have been natural for Christians to refer to themselves as "the friends of Christ." Some philosophical groups in the Greek world used terms of friendship to describe close relationships between their members. However, early Christians chose to use other words to describe themselves, such as "followers of Jesus" or "disciples."</w:t>
+        <w:t xml:space="preserve">). The word </w:t>
+      </w:r>
+      <w:r>
+        <w:rPr>
+          <w:i/>
+          <w:lang w:val="en_US" w:bidi="en_US"/>
+        </w:rPr>
+        <w:t>friends</w:t>
+      </w:r>
+      <w:r>
+        <w:rPr>
+          <w:lang w:val="en_US" w:bidi="en_US"/>
+        </w:rPr>
+        <w:t xml:space="preserve"> can have different meanings and nuances depending on the culture, the language, or the context in which it is used.</w:t>
+      </w:r>
+    </w:p>
+    <w:p>
+      <w:pPr/>
+      <w:r>
+        <w:rPr>
+          <w:lang w:val="en_US" w:bidi="en_US"/>
+        </w:rPr>
+      </w:r>
+      <w:r>
+        <w:rPr>
+          <w:lang w:val="en_US" w:bidi="en_US"/>
+        </w:rPr>
+        <w:t xml:space="preserve">The New Testament is written in Greek and uses the Greek word for “friends.” However, the Greeks and Romans (who also used the Greek language) had a different concept of friendship than many cultures today. For instance, some philosophical groups in the Greek world used terms of friendship to describe close relationships between their members. These concepts of friendship were also different from the way the Old Testament depicts friendly relationships. </w:t>
+      </w:r>
+    </w:p>
+    <w:p>
+      <w:pPr/>
+      <w:r>
+        <w:rPr>
+          <w:lang w:val="en_US" w:bidi="en_US"/>
+        </w:rPr>
+      </w:r>
+      <w:r>
+        <w:rPr>
+          <w:lang w:val="en_US" w:bidi="en_US"/>
+        </w:rPr>
+        <w:t xml:space="preserve">Even though Jesus called his disciples his friends, they did not call him their friend. Indeed, early Christians did not call themselves “the friends of Jesus.” They used other words to describe their relationship with him, such as </w:t>
+      </w:r>
+      <w:r>
+        <w:rPr>
+          <w:i/>
+          <w:lang w:val="en_US" w:bidi="en_US"/>
+        </w:rPr>
+        <w:t>disciples</w:t>
+      </w:r>
+      <w:r>
+        <w:rPr>
+          <w:lang w:val="en_US" w:bidi="en_US"/>
+        </w:rPr>
+        <w:t xml:space="preserve"> or </w:t>
+      </w:r>
+      <w:r>
+        <w:rPr>
+          <w:i/>
+          <w:lang w:val="en_US" w:bidi="en_US"/>
+        </w:rPr>
+        <w:t>servants</w:t>
+      </w:r>
+      <w:r>
+        <w:rPr>
+          <w:lang w:val="en_US" w:bidi="en_US"/>
+        </w:rPr>
+        <w:t>.</w:t>
       </w:r>
       <w:r>
         <w:rPr>

</xml_diff>